<commit_message>
Otras Modificaciones de las plantillas
</commit_message>
<xml_diff>
--- a/output/6216__843-26__M_V_DG_M/plantilla2.docx
+++ b/output/6216__843-26__M_V_DG_M/plantilla2.docx
@@ -122,12 +122,12 @@
                             <w:pPr>
                               <w:jc w:val="center"/>
                               <w:rPr>
-                                <w:rStyle w:val="CdigoHTML"/>
+                                <w:b/>
                               </w:rPr>
                             </w:pPr>
                             <w:r>
                               <w:rPr>
-                                <w:rStyle w:val="CdigoHTML"/>
+                                <w:b/>
                               </w:rPr>
                               <w:t xml:space="preserve">202500001193</w:t>
                             </w:r>
@@ -135,6 +135,11 @@
                           <w:p>
                             <w:pPr>
                               <w:jc w:val="center"/>
+                              <w:rPr>
+                                <w:b/>
+                                <w:sz w:val="20"/>
+                                <w:szCs w:val="20"/>
+                              </w:rPr>
                             </w:pPr>
                             <w:r>
                               <w:rPr>
@@ -145,6 +150,11 @@
                               <w:t xml:space="preserve">VÍCTIMA: </w:t>
                             </w:r>
                             <w:r>
+                              <w:rPr>
+                                <w:b/>
+                                <w:sz w:val="20"/>
+                                <w:szCs w:val="20"/>
+                              </w:rPr>
                               <w:t xml:space="preserve">M.V.DG.M.</w:t>
                             </w:r>
                             <w:r>
@@ -156,6 +166,11 @@
                               <w:t xml:space="preserve"> EDAD: </w:t>
                             </w:r>
                             <w:r>
+                              <w:rPr>
+                                <w:b/>
+                                <w:sz w:val="20"/>
+                                <w:szCs w:val="20"/>
+                              </w:rPr>
                               <w:t xml:space="preserve">06 años</w:t>
                             </w:r>
                           </w:p>
@@ -168,8 +183,6 @@
                                 <w:szCs w:val="20"/>
                               </w:rPr>
                             </w:pPr>
-                            <w:bookmarkStart w:id="0" w:name="_GoBack"/>
-                            <w:bookmarkEnd w:id="0"/>
                           </w:p>
                         </w:txbxContent>
                       </wps:txbx>
@@ -236,12 +249,12 @@
                       <w:pPr>
                         <w:jc w:val="center"/>
                         <w:rPr>
-                          <w:rStyle w:val="CdigoHTML"/>
+                          <w:b/>
                         </w:rPr>
                       </w:pPr>
                       <w:r>
                         <w:rPr>
-                          <w:rStyle w:val="CdigoHTML"/>
+                          <w:b/>
                         </w:rPr>
                         <w:t xml:space="preserve">202500001193</w:t>
                       </w:r>
@@ -249,6 +262,11 @@
                     <w:p>
                       <w:pPr>
                         <w:jc w:val="center"/>
+                        <w:rPr>
+                          <w:b/>
+                          <w:sz w:val="20"/>
+                          <w:szCs w:val="20"/>
+                        </w:rPr>
                       </w:pPr>
                       <w:r>
                         <w:rPr>
@@ -259,6 +277,11 @@
                         <w:t xml:space="preserve">VÍCTIMA: </w:t>
                       </w:r>
                       <w:r>
+                        <w:rPr>
+                          <w:b/>
+                          <w:sz w:val="20"/>
+                          <w:szCs w:val="20"/>
+                        </w:rPr>
                         <w:t xml:space="preserve">M.V.DG.M.</w:t>
                       </w:r>
                       <w:r>
@@ -270,6 +293,11 @@
                         <w:t xml:space="preserve"> EDAD: </w:t>
                       </w:r>
                       <w:r>
+                        <w:rPr>
+                          <w:b/>
+                          <w:sz w:val="20"/>
+                          <w:szCs w:val="20"/>
+                        </w:rPr>
                         <w:t xml:space="preserve">06 años</w:t>
                       </w:r>
                     </w:p>
@@ -282,8 +310,6 @@
                           <w:szCs w:val="20"/>
                         </w:rPr>
                       </w:pPr>
-                      <w:bookmarkStart w:id="1" w:name="_GoBack"/>
-                      <w:bookmarkEnd w:id="1"/>
                     </w:p>
                   </w:txbxContent>
                 </v:textbox>
@@ -454,12 +480,12 @@
                             <w:pPr>
                               <w:jc w:val="center"/>
                               <w:rPr>
-                                <w:rStyle w:val="CdigoHTML"/>
+                                <w:b/>
                               </w:rPr>
                             </w:pPr>
                             <w:r>
                               <w:rPr>
-                                <w:rStyle w:val="CdigoHTML"/>
+                                <w:b/>
                               </w:rPr>
                               <w:t xml:space="preserve">202500001193</w:t>
                             </w:r>
@@ -467,33 +493,23 @@
                           <w:p>
                             <w:pPr>
                               <w:jc w:val="center"/>
+                              <w:rPr>
+                                <w:b/>
+                              </w:rPr>
                             </w:pPr>
                             <w:r>
                               <w:rPr>
                                 <w:b/>
-                                <w:sz w:val="20"/>
-                                <w:szCs w:val="20"/>
                               </w:rPr>
-                              <w:t xml:space="preserve">VÍCTIMA: </w:t>
-                            </w:r>
-                            <w:r>
-                              <w:t xml:space="preserve">M.V.DG.M.</w:t>
-                            </w:r>
-                            <w:r>
-                              <w:rPr>
-                                <w:b/>
-                                <w:sz w:val="20"/>
-                                <w:szCs w:val="20"/>
-                              </w:rPr>
-                              <w:t xml:space="preserve"> EDAD: </w:t>
-                            </w:r>
-                            <w:r>
-                              <w:t xml:space="preserve">06 años</w:t>
+                              <w:t xml:space="preserve">VÍCTIMA: M.V.DG.M. EDAD: 06 años</w:t>
                             </w:r>
                           </w:p>
                           <w:p>
                             <w:pPr>
                               <w:jc w:val="center"/>
+                              <w:rPr>
+                                <w:b/>
+                              </w:rPr>
                             </w:pPr>
                           </w:p>
                           <w:p>
@@ -501,8 +517,6 @@
                               <w:jc w:val="center"/>
                               <w:rPr>
                                 <w:b/>
-                                <w:sz w:val="20"/>
-                                <w:szCs w:val="20"/>
                               </w:rPr>
                             </w:pPr>
                           </w:p>
@@ -571,12 +585,12 @@
                       <w:pPr>
                         <w:jc w:val="center"/>
                         <w:rPr>
-                          <w:rStyle w:val="CdigoHTML"/>
+                          <w:b/>
                         </w:rPr>
                       </w:pPr>
                       <w:r>
                         <w:rPr>
-                          <w:rStyle w:val="CdigoHTML"/>
+                          <w:b/>
                         </w:rPr>
                         <w:t xml:space="preserve">202500001193</w:t>
                       </w:r>
@@ -584,33 +598,23 @@
                     <w:p>
                       <w:pPr>
                         <w:jc w:val="center"/>
+                        <w:rPr>
+                          <w:b/>
+                        </w:rPr>
                       </w:pPr>
                       <w:r>
                         <w:rPr>
                           <w:b/>
-                          <w:sz w:val="20"/>
-                          <w:szCs w:val="20"/>
                         </w:rPr>
-                        <w:t xml:space="preserve">VÍCTIMA: </w:t>
-                      </w:r>
-                      <w:r>
-                        <w:t xml:space="preserve">M.V.DG.M.</w:t>
-                      </w:r>
-                      <w:r>
-                        <w:rPr>
-                          <w:b/>
-                          <w:sz w:val="20"/>
-                          <w:szCs w:val="20"/>
-                        </w:rPr>
-                        <w:t xml:space="preserve"> EDAD: </w:t>
-                      </w:r>
-                      <w:r>
-                        <w:t xml:space="preserve">06 años</w:t>
+                        <w:t xml:space="preserve">VÍCTIMA: M.V.DG.M. EDAD: 06 años</w:t>
                       </w:r>
                     </w:p>
                     <w:p>
                       <w:pPr>
                         <w:jc w:val="center"/>
+                        <w:rPr>
+                          <w:b/>
+                        </w:rPr>
                       </w:pPr>
                     </w:p>
                     <w:p>
@@ -618,8 +622,6 @@
                         <w:jc w:val="center"/>
                         <w:rPr>
                           <w:b/>
-                          <w:sz w:val="20"/>
-                          <w:szCs w:val="20"/>
                         </w:rPr>
                       </w:pPr>
                     </w:p>
@@ -718,17 +720,19 @@
                               </w:rPr>
                               <w:t>CARPETILLA</w:t>
                             </w:r>
+                            <w:bookmarkStart w:id="0" w:name="_GoBack"/>
+                            <w:bookmarkEnd w:id="0"/>
                           </w:p>
                           <w:p>
                             <w:pPr>
                               <w:jc w:val="center"/>
                               <w:rPr>
-                                <w:rStyle w:val="CdigoHTML"/>
+                                <w:b/>
                               </w:rPr>
                             </w:pPr>
                             <w:r>
                               <w:rPr>
-                                <w:rStyle w:val="CdigoHTML"/>
+                                <w:b/>
                               </w:rPr>
                               <w:t xml:space="preserve">202500001193</w:t>
                             </w:r>
@@ -736,28 +740,15 @@
                           <w:p>
                             <w:pPr>
                               <w:jc w:val="center"/>
+                              <w:rPr>
+                                <w:b/>
+                              </w:rPr>
                             </w:pPr>
                             <w:r>
                               <w:rPr>
                                 <w:b/>
-                                <w:sz w:val="20"/>
-                                <w:szCs w:val="20"/>
                               </w:rPr>
-                              <w:t xml:space="preserve">VÍCTIMA: </w:t>
-                            </w:r>
-                            <w:r>
-                              <w:t xml:space="preserve">M.V.DG.M.</w:t>
-                            </w:r>
-                            <w:r>
-                              <w:rPr>
-                                <w:b/>
-                                <w:sz w:val="20"/>
-                                <w:szCs w:val="20"/>
-                              </w:rPr>
-                              <w:t xml:space="preserve"> EDAD: </w:t>
-                            </w:r>
-                            <w:r>
-                              <w:t xml:space="preserve">06 años</w:t>
+                              <w:t xml:space="preserve">VÍCTIMA: M.V.DG.M. EDAD: 06 años</w:t>
                             </w:r>
                           </w:p>
                           <w:p>
@@ -765,8 +756,6 @@
                               <w:jc w:val="center"/>
                               <w:rPr>
                                 <w:b/>
-                                <w:sz w:val="20"/>
-                                <w:szCs w:val="20"/>
                               </w:rPr>
                             </w:pPr>
                           </w:p>
@@ -830,17 +819,19 @@
                         </w:rPr>
                         <w:t>CARPETILLA</w:t>
                       </w:r>
+                      <w:bookmarkStart w:id="1" w:name="_GoBack"/>
+                      <w:bookmarkEnd w:id="1"/>
                     </w:p>
                     <w:p>
                       <w:pPr>
                         <w:jc w:val="center"/>
                         <w:rPr>
-                          <w:rStyle w:val="CdigoHTML"/>
+                          <w:b/>
                         </w:rPr>
                       </w:pPr>
                       <w:r>
                         <w:rPr>
-                          <w:rStyle w:val="CdigoHTML"/>
+                          <w:b/>
                         </w:rPr>
                         <w:t xml:space="preserve">202500001193</w:t>
                       </w:r>
@@ -848,28 +839,15 @@
                     <w:p>
                       <w:pPr>
                         <w:jc w:val="center"/>
+                        <w:rPr>
+                          <w:b/>
+                        </w:rPr>
                       </w:pPr>
                       <w:r>
                         <w:rPr>
                           <w:b/>
-                          <w:sz w:val="20"/>
-                          <w:szCs w:val="20"/>
                         </w:rPr>
-                        <w:t xml:space="preserve">VÍCTIMA: </w:t>
-                      </w:r>
-                      <w:r>
-                        <w:t xml:space="preserve">M.V.DG.M.</w:t>
-                      </w:r>
-                      <w:r>
-                        <w:rPr>
-                          <w:b/>
-                          <w:sz w:val="20"/>
-                          <w:szCs w:val="20"/>
-                        </w:rPr>
-                        <w:t xml:space="preserve"> EDAD: </w:t>
-                      </w:r>
-                      <w:r>
-                        <w:t xml:space="preserve">06 años</w:t>
+                        <w:t xml:space="preserve">VÍCTIMA: M.V.DG.M. EDAD: 06 años</w:t>
                       </w:r>
                     </w:p>
                     <w:p>
@@ -877,8 +855,6 @@
                         <w:jc w:val="center"/>
                         <w:rPr>
                           <w:b/>
-                          <w:sz w:val="20"/>
-                          <w:szCs w:val="20"/>
                         </w:rPr>
                       </w:pPr>
                     </w:p>
@@ -982,12 +958,12 @@
                             <w:pPr>
                               <w:jc w:val="center"/>
                               <w:rPr>
-                                <w:rStyle w:val="CdigoHTML"/>
+                                <w:b/>
                               </w:rPr>
                             </w:pPr>
                             <w:r>
                               <w:rPr>
-                                <w:rStyle w:val="CdigoHTML"/>
+                                <w:b/>
                               </w:rPr>
                               <w:t xml:space="preserve">202500001193</w:t>
                             </w:r>
@@ -995,28 +971,15 @@
                           <w:p>
                             <w:pPr>
                               <w:jc w:val="center"/>
+                              <w:rPr>
+                                <w:b/>
+                              </w:rPr>
                             </w:pPr>
                             <w:r>
                               <w:rPr>
                                 <w:b/>
-                                <w:sz w:val="20"/>
-                                <w:szCs w:val="20"/>
                               </w:rPr>
-                              <w:t xml:space="preserve">VÍCTIMA: </w:t>
-                            </w:r>
-                            <w:r>
-                              <w:t xml:space="preserve">M.V.DG.M.</w:t>
-                            </w:r>
-                            <w:r>
-                              <w:rPr>
-                                <w:b/>
-                                <w:sz w:val="20"/>
-                                <w:szCs w:val="20"/>
-                              </w:rPr>
-                              <w:t xml:space="preserve"> EDAD: </w:t>
-                            </w:r>
-                            <w:r>
-                              <w:t xml:space="preserve">06 años</w:t>
+                              <w:t xml:space="preserve">VÍCTIMA: M.V.DG.M. EDAD: 06 años</w:t>
                             </w:r>
                           </w:p>
                           <w:p>
@@ -1024,8 +987,6 @@
                               <w:jc w:val="center"/>
                               <w:rPr>
                                 <w:b/>
-                                <w:sz w:val="20"/>
-                                <w:szCs w:val="20"/>
                               </w:rPr>
                             </w:pPr>
                           </w:p>
@@ -1034,8 +995,6 @@
                               <w:jc w:val="center"/>
                               <w:rPr>
                                 <w:b/>
-                                <w:sz w:val="20"/>
-                                <w:szCs w:val="20"/>
                               </w:rPr>
                             </w:pPr>
                           </w:p>
@@ -1104,12 +1063,12 @@
                       <w:pPr>
                         <w:jc w:val="center"/>
                         <w:rPr>
-                          <w:rStyle w:val="CdigoHTML"/>
+                          <w:b/>
                         </w:rPr>
                       </w:pPr>
                       <w:r>
                         <w:rPr>
-                          <w:rStyle w:val="CdigoHTML"/>
+                          <w:b/>
                         </w:rPr>
                         <w:t xml:space="preserve">202500001193</w:t>
                       </w:r>
@@ -1117,28 +1076,15 @@
                     <w:p>
                       <w:pPr>
                         <w:jc w:val="center"/>
+                        <w:rPr>
+                          <w:b/>
+                        </w:rPr>
                       </w:pPr>
                       <w:r>
                         <w:rPr>
                           <w:b/>
-                          <w:sz w:val="20"/>
-                          <w:szCs w:val="20"/>
                         </w:rPr>
-                        <w:t xml:space="preserve">VÍCTIMA: </w:t>
-                      </w:r>
-                      <w:r>
-                        <w:t xml:space="preserve">M.V.DG.M.</w:t>
-                      </w:r>
-                      <w:r>
-                        <w:rPr>
-                          <w:b/>
-                          <w:sz w:val="20"/>
-                          <w:szCs w:val="20"/>
-                        </w:rPr>
-                        <w:t xml:space="preserve"> EDAD: </w:t>
-                      </w:r>
-                      <w:r>
-                        <w:t xml:space="preserve">06 años</w:t>
+                        <w:t xml:space="preserve">VÍCTIMA: M.V.DG.M. EDAD: 06 años</w:t>
                       </w:r>
                     </w:p>
                     <w:p>
@@ -1146,8 +1092,6 @@
                         <w:jc w:val="center"/>
                         <w:rPr>
                           <w:b/>
-                          <w:sz w:val="20"/>
-                          <w:szCs w:val="20"/>
                         </w:rPr>
                       </w:pPr>
                     </w:p>
@@ -1156,8 +1100,6 @@
                         <w:jc w:val="center"/>
                         <w:rPr>
                           <w:b/>
-                          <w:sz w:val="20"/>
-                          <w:szCs w:val="20"/>
                         </w:rPr>
                       </w:pPr>
                     </w:p>
@@ -1261,12 +1203,12 @@
                             <w:pPr>
                               <w:jc w:val="center"/>
                               <w:rPr>
-                                <w:rStyle w:val="CdigoHTML"/>
+                                <w:b/>
                               </w:rPr>
                             </w:pPr>
                             <w:r>
                               <w:rPr>
-                                <w:rStyle w:val="CdigoHTML"/>
+                                <w:b/>
                               </w:rPr>
                               <w:t xml:space="preserve">202500001193</w:t>
                             </w:r>
@@ -1274,28 +1216,15 @@
                           <w:p>
                             <w:pPr>
                               <w:jc w:val="center"/>
+                              <w:rPr>
+                                <w:b/>
+                              </w:rPr>
                             </w:pPr>
                             <w:r>
                               <w:rPr>
                                 <w:b/>
-                                <w:sz w:val="20"/>
-                                <w:szCs w:val="20"/>
                               </w:rPr>
-                              <w:t xml:space="preserve">VÍCTIMA: </w:t>
-                            </w:r>
-                            <w:r>
-                              <w:t xml:space="preserve">M.V.DG.M.</w:t>
-                            </w:r>
-                            <w:r>
-                              <w:rPr>
-                                <w:b/>
-                                <w:sz w:val="20"/>
-                                <w:szCs w:val="20"/>
-                              </w:rPr>
-                              <w:t xml:space="preserve"> EDAD: </w:t>
-                            </w:r>
-                            <w:r>
-                              <w:t xml:space="preserve">06 años</w:t>
+                              <w:t xml:space="preserve">VÍCTIMA: M.V.DG.M. EDAD: 06 años</w:t>
                             </w:r>
                           </w:p>
                           <w:p>
@@ -1303,8 +1232,6 @@
                               <w:jc w:val="center"/>
                               <w:rPr>
                                 <w:b/>
-                                <w:sz w:val="20"/>
-                                <w:szCs w:val="20"/>
                               </w:rPr>
                             </w:pPr>
                           </w:p>
@@ -1373,12 +1300,12 @@
                       <w:pPr>
                         <w:jc w:val="center"/>
                         <w:rPr>
-                          <w:rStyle w:val="CdigoHTML"/>
+                          <w:b/>
                         </w:rPr>
                       </w:pPr>
                       <w:r>
                         <w:rPr>
-                          <w:rStyle w:val="CdigoHTML"/>
+                          <w:b/>
                         </w:rPr>
                         <w:t xml:space="preserve">202500001193</w:t>
                       </w:r>
@@ -1386,28 +1313,15 @@
                     <w:p>
                       <w:pPr>
                         <w:jc w:val="center"/>
+                        <w:rPr>
+                          <w:b/>
+                        </w:rPr>
                       </w:pPr>
                       <w:r>
                         <w:rPr>
                           <w:b/>
-                          <w:sz w:val="20"/>
-                          <w:szCs w:val="20"/>
                         </w:rPr>
-                        <w:t xml:space="preserve">VÍCTIMA: </w:t>
-                      </w:r>
-                      <w:r>
-                        <w:t xml:space="preserve">M.V.DG.M.</w:t>
-                      </w:r>
-                      <w:r>
-                        <w:rPr>
-                          <w:b/>
-                          <w:sz w:val="20"/>
-                          <w:szCs w:val="20"/>
-                        </w:rPr>
-                        <w:t xml:space="preserve"> EDAD: </w:t>
-                      </w:r>
-                      <w:r>
-                        <w:t xml:space="preserve">06 años</w:t>
+                        <w:t xml:space="preserve">VÍCTIMA: M.V.DG.M. EDAD: 06 años</w:t>
                       </w:r>
                     </w:p>
                     <w:p>
@@ -1415,8 +1329,6 @@
                         <w:jc w:val="center"/>
                         <w:rPr>
                           <w:b/>
-                          <w:sz w:val="20"/>
-                          <w:szCs w:val="20"/>
                         </w:rPr>
                       </w:pPr>
                     </w:p>
@@ -1495,15 +1407,7 @@
                                 <w:sz w:val="20"/>
                                 <w:szCs w:val="20"/>
                               </w:rPr>
-                              <w:t xml:space="preserve">OFICINA </w:t>
-                            </w:r>
-                            <w:r>
-                              <w:rPr>
-                                <w:b/>
-                                <w:sz w:val="20"/>
-                                <w:szCs w:val="20"/>
-                              </w:rPr>
-                              <w:t>JUDICIAL</w:t>
+                              <w:t>OFICINA JUDICIAL</w:t>
                             </w:r>
                           </w:p>
                           <w:p>
@@ -1528,12 +1432,12 @@
                             <w:pPr>
                               <w:jc w:val="center"/>
                               <w:rPr>
-                                <w:rStyle w:val="CdigoHTML"/>
+                                <w:b/>
                               </w:rPr>
                             </w:pPr>
                             <w:r>
                               <w:rPr>
-                                <w:rStyle w:val="CdigoHTML"/>
+                                <w:b/>
                               </w:rPr>
                               <w:t xml:space="preserve">202500001193</w:t>
                             </w:r>
@@ -1541,28 +1445,15 @@
                           <w:p>
                             <w:pPr>
                               <w:jc w:val="center"/>
+                              <w:rPr>
+                                <w:b/>
+                              </w:rPr>
                             </w:pPr>
                             <w:r>
                               <w:rPr>
                                 <w:b/>
-                                <w:sz w:val="20"/>
-                                <w:szCs w:val="20"/>
                               </w:rPr>
-                              <w:t xml:space="preserve">VÍCTIMA: </w:t>
-                            </w:r>
-                            <w:r>
-                              <w:t xml:space="preserve">M.V.DG.M.</w:t>
-                            </w:r>
-                            <w:r>
-                              <w:rPr>
-                                <w:b/>
-                                <w:sz w:val="20"/>
-                                <w:szCs w:val="20"/>
-                              </w:rPr>
-                              <w:t xml:space="preserve"> EDAD: </w:t>
-                            </w:r>
-                            <w:r>
-                              <w:t xml:space="preserve">06 años</w:t>
+                              <w:t xml:space="preserve">VÍCTIMA: M.V.DG.M. EDAD: 06 años</w:t>
                             </w:r>
                           </w:p>
                           <w:p>
@@ -1570,8 +1461,6 @@
                               <w:jc w:val="center"/>
                               <w:rPr>
                                 <w:b/>
-                                <w:sz w:val="20"/>
-                                <w:szCs w:val="20"/>
                               </w:rPr>
                             </w:pPr>
                           </w:p>
@@ -1615,15 +1504,7 @@
                           <w:sz w:val="20"/>
                           <w:szCs w:val="20"/>
                         </w:rPr>
-                        <w:t xml:space="preserve">OFICINA </w:t>
-                      </w:r>
-                      <w:r>
-                        <w:rPr>
-                          <w:b/>
-                          <w:sz w:val="20"/>
-                          <w:szCs w:val="20"/>
-                        </w:rPr>
-                        <w:t>JUDICIAL</w:t>
+                        <w:t>OFICINA JUDICIAL</w:t>
                       </w:r>
                     </w:p>
                     <w:p>
@@ -1648,12 +1529,12 @@
                       <w:pPr>
                         <w:jc w:val="center"/>
                         <w:rPr>
-                          <w:rStyle w:val="CdigoHTML"/>
+                          <w:b/>
                         </w:rPr>
                       </w:pPr>
                       <w:r>
                         <w:rPr>
-                          <w:rStyle w:val="CdigoHTML"/>
+                          <w:b/>
                         </w:rPr>
                         <w:t xml:space="preserve">202500001193</w:t>
                       </w:r>
@@ -1661,28 +1542,15 @@
                     <w:p>
                       <w:pPr>
                         <w:jc w:val="center"/>
+                        <w:rPr>
+                          <w:b/>
+                        </w:rPr>
                       </w:pPr>
                       <w:r>
                         <w:rPr>
                           <w:b/>
-                          <w:sz w:val="20"/>
-                          <w:szCs w:val="20"/>
                         </w:rPr>
-                        <w:t xml:space="preserve">VÍCTIMA: </w:t>
-                      </w:r>
-                      <w:r>
-                        <w:t xml:space="preserve">M.V.DG.M.</w:t>
-                      </w:r>
-                      <w:r>
-                        <w:rPr>
-                          <w:b/>
-                          <w:sz w:val="20"/>
-                          <w:szCs w:val="20"/>
-                        </w:rPr>
-                        <w:t xml:space="preserve"> EDAD: </w:t>
-                      </w:r>
-                      <w:r>
-                        <w:t xml:space="preserve">06 años</w:t>
+                        <w:t xml:space="preserve">VÍCTIMA: M.V.DG.M. EDAD: 06 años</w:t>
                       </w:r>
                     </w:p>
                     <w:p>
@@ -1690,8 +1558,6 @@
                         <w:jc w:val="center"/>
                         <w:rPr>
                           <w:b/>
-                          <w:sz w:val="20"/>
-                          <w:szCs w:val="20"/>
                         </w:rPr>
                       </w:pPr>
                     </w:p>
@@ -1769,15 +1635,7 @@
                                 <w:sz w:val="20"/>
                                 <w:szCs w:val="20"/>
                               </w:rPr>
-                              <w:t xml:space="preserve">OFICINA </w:t>
-                            </w:r>
-                            <w:r>
-                              <w:rPr>
-                                <w:b/>
-                                <w:sz w:val="20"/>
-                                <w:szCs w:val="20"/>
-                              </w:rPr>
-                              <w:t>JUDICIAL</w:t>
+                              <w:t>OFICINA JUDICIAL</w:t>
                             </w:r>
                           </w:p>
                           <w:p>
@@ -1802,12 +1660,12 @@
                             <w:pPr>
                               <w:jc w:val="center"/>
                               <w:rPr>
-                                <w:rStyle w:val="CdigoHTML"/>
+                                <w:b/>
                               </w:rPr>
                             </w:pPr>
                             <w:r>
                               <w:rPr>
-                                <w:rStyle w:val="CdigoHTML"/>
+                                <w:b/>
                               </w:rPr>
                               <w:t xml:space="preserve">202500001193</w:t>
                             </w:r>
@@ -1815,28 +1673,15 @@
                           <w:p>
                             <w:pPr>
                               <w:jc w:val="center"/>
+                              <w:rPr>
+                                <w:b/>
+                              </w:rPr>
                             </w:pPr>
                             <w:r>
                               <w:rPr>
                                 <w:b/>
-                                <w:sz w:val="20"/>
-                                <w:szCs w:val="20"/>
                               </w:rPr>
-                              <w:t xml:space="preserve">VÍCTIMA: </w:t>
-                            </w:r>
-                            <w:r>
-                              <w:t xml:space="preserve">M.V.DG.M.</w:t>
-                            </w:r>
-                            <w:r>
-                              <w:rPr>
-                                <w:b/>
-                                <w:sz w:val="20"/>
-                                <w:szCs w:val="20"/>
-                              </w:rPr>
-                              <w:t xml:space="preserve"> EDAD: </w:t>
-                            </w:r>
-                            <w:r>
-                              <w:t xml:space="preserve">06 años</w:t>
+                              <w:t xml:space="preserve">VÍCTIMA: M.V.DG.M. EDAD: 06 años</w:t>
                             </w:r>
                           </w:p>
                           <w:p>
@@ -1844,8 +1689,6 @@
                               <w:jc w:val="center"/>
                               <w:rPr>
                                 <w:b/>
-                                <w:sz w:val="20"/>
-                                <w:szCs w:val="20"/>
                               </w:rPr>
                             </w:pPr>
                           </w:p>
@@ -1854,8 +1697,6 @@
                               <w:jc w:val="center"/>
                               <w:rPr>
                                 <w:b/>
-                                <w:sz w:val="20"/>
-                                <w:szCs w:val="20"/>
                               </w:rPr>
                             </w:pPr>
                           </w:p>
@@ -1899,15 +1740,7 @@
                           <w:sz w:val="20"/>
                           <w:szCs w:val="20"/>
                         </w:rPr>
-                        <w:t xml:space="preserve">OFICINA </w:t>
-                      </w:r>
-                      <w:r>
-                        <w:rPr>
-                          <w:b/>
-                          <w:sz w:val="20"/>
-                          <w:szCs w:val="20"/>
-                        </w:rPr>
-                        <w:t>JUDICIAL</w:t>
+                        <w:t>OFICINA JUDICIAL</w:t>
                       </w:r>
                     </w:p>
                     <w:p>
@@ -1932,12 +1765,12 @@
                       <w:pPr>
                         <w:jc w:val="center"/>
                         <w:rPr>
-                          <w:rStyle w:val="CdigoHTML"/>
+                          <w:b/>
                         </w:rPr>
                       </w:pPr>
                       <w:r>
                         <w:rPr>
-                          <w:rStyle w:val="CdigoHTML"/>
+                          <w:b/>
                         </w:rPr>
                         <w:t xml:space="preserve">202500001193</w:t>
                       </w:r>
@@ -1945,28 +1778,15 @@
                     <w:p>
                       <w:pPr>
                         <w:jc w:val="center"/>
+                        <w:rPr>
+                          <w:b/>
+                        </w:rPr>
                       </w:pPr>
                       <w:r>
                         <w:rPr>
                           <w:b/>
-                          <w:sz w:val="20"/>
-                          <w:szCs w:val="20"/>
                         </w:rPr>
-                        <w:t xml:space="preserve">VÍCTIMA: </w:t>
-                      </w:r>
-                      <w:r>
-                        <w:t xml:space="preserve">M.V.DG.M.</w:t>
-                      </w:r>
-                      <w:r>
-                        <w:rPr>
-                          <w:b/>
-                          <w:sz w:val="20"/>
-                          <w:szCs w:val="20"/>
-                        </w:rPr>
-                        <w:t xml:space="preserve"> EDAD: </w:t>
-                      </w:r>
-                      <w:r>
-                        <w:t xml:space="preserve">06 años</w:t>
+                        <w:t xml:space="preserve">VÍCTIMA: M.V.DG.M. EDAD: 06 años</w:t>
                       </w:r>
                     </w:p>
                     <w:p>
@@ -1974,8 +1794,6 @@
                         <w:jc w:val="center"/>
                         <w:rPr>
                           <w:b/>
-                          <w:sz w:val="20"/>
-                          <w:szCs w:val="20"/>
                         </w:rPr>
                       </w:pPr>
                     </w:p>
@@ -1984,8 +1802,6 @@
                         <w:jc w:val="center"/>
                         <w:rPr>
                           <w:b/>
-                          <w:sz w:val="20"/>
-                          <w:szCs w:val="20"/>
                         </w:rPr>
                       </w:pPr>
                     </w:p>
@@ -2088,12 +1904,12 @@
                             <w:pPr>
                               <w:jc w:val="center"/>
                               <w:rPr>
-                                <w:rStyle w:val="CdigoHTML"/>
+                                <w:b/>
                               </w:rPr>
                             </w:pPr>
                             <w:r>
                               <w:rPr>
-                                <w:rStyle w:val="CdigoHTML"/>
+                                <w:b/>
                               </w:rPr>
                               <w:t xml:space="preserve">202500001193</w:t>
                             </w:r>
@@ -2101,28 +1917,15 @@
                           <w:p>
                             <w:pPr>
                               <w:jc w:val="center"/>
+                              <w:rPr>
+                                <w:b/>
+                              </w:rPr>
                             </w:pPr>
                             <w:r>
                               <w:rPr>
                                 <w:b/>
-                                <w:sz w:val="20"/>
-                                <w:szCs w:val="20"/>
                               </w:rPr>
-                              <w:t xml:space="preserve">VÍCTIMA: </w:t>
-                            </w:r>
-                            <w:r>
-                              <w:t xml:space="preserve">M.V.DG.M.</w:t>
-                            </w:r>
-                            <w:r>
-                              <w:rPr>
-                                <w:b/>
-                                <w:sz w:val="20"/>
-                                <w:szCs w:val="20"/>
-                              </w:rPr>
-                              <w:t xml:space="preserve"> EDAD: </w:t>
-                            </w:r>
-                            <w:r>
-                              <w:t xml:space="preserve">06 años</w:t>
+                              <w:t xml:space="preserve">VÍCTIMA: M.V.DG.M. EDAD: 06 años</w:t>
                             </w:r>
                           </w:p>
                           <w:p>
@@ -2130,8 +1933,6 @@
                               <w:jc w:val="center"/>
                               <w:rPr>
                                 <w:b/>
-                                <w:sz w:val="20"/>
-                                <w:szCs w:val="20"/>
                               </w:rPr>
                             </w:pPr>
                           </w:p>
@@ -2210,12 +2011,12 @@
                       <w:pPr>
                         <w:jc w:val="center"/>
                         <w:rPr>
-                          <w:rStyle w:val="CdigoHTML"/>
+                          <w:b/>
                         </w:rPr>
                       </w:pPr>
                       <w:r>
                         <w:rPr>
-                          <w:rStyle w:val="CdigoHTML"/>
+                          <w:b/>
                         </w:rPr>
                         <w:t xml:space="preserve">202500001193</w:t>
                       </w:r>
@@ -2223,28 +2024,15 @@
                     <w:p>
                       <w:pPr>
                         <w:jc w:val="center"/>
+                        <w:rPr>
+                          <w:b/>
+                        </w:rPr>
                       </w:pPr>
                       <w:r>
                         <w:rPr>
                           <w:b/>
-                          <w:sz w:val="20"/>
-                          <w:szCs w:val="20"/>
                         </w:rPr>
-                        <w:t xml:space="preserve">VÍCTIMA: </w:t>
-                      </w:r>
-                      <w:r>
-                        <w:t xml:space="preserve">M.V.DG.M.</w:t>
-                      </w:r>
-                      <w:r>
-                        <w:rPr>
-                          <w:b/>
-                          <w:sz w:val="20"/>
-                          <w:szCs w:val="20"/>
-                        </w:rPr>
-                        <w:t xml:space="preserve"> EDAD: </w:t>
-                      </w:r>
-                      <w:r>
-                        <w:t xml:space="preserve">06 años</w:t>
+                        <w:t xml:space="preserve">VÍCTIMA: M.V.DG.M. EDAD: 06 años</w:t>
                       </w:r>
                     </w:p>
                     <w:p>
@@ -2252,8 +2040,6 @@
                         <w:jc w:val="center"/>
                         <w:rPr>
                           <w:b/>
-                          <w:sz w:val="20"/>
-                          <w:szCs w:val="20"/>
                         </w:rPr>
                       </w:pPr>
                     </w:p>
@@ -6563,7 +6349,7 @@
     <w:lsdException w:name="Table Web 2" w:semiHidden="1" w:unhideWhenUsed="1"/>
     <w:lsdException w:name="Table Web 3" w:semiHidden="1" w:unhideWhenUsed="1"/>
     <w:lsdException w:name="Balloon Text" w:semiHidden="1" w:unhideWhenUsed="1"/>
-    <w:lsdException w:name="Table Grid" w:semiHidden="1" w:uiPriority="59" w:unhideWhenUsed="1"/>
+    <w:lsdException w:name="Table Grid" w:uiPriority="59"/>
     <w:lsdException w:name="Table Theme" w:semiHidden="1" w:unhideWhenUsed="1"/>
     <w:lsdException w:name="Placeholder Text" w:semiHidden="1"/>
     <w:lsdException w:name="No Spacing" w:uiPriority="1" w:qFormat="1"/>
@@ -18615,7 +18401,7 @@
 </file>
 
 <file path=customXml/itemProps1.xml><?xml version="1.0" encoding="utf-8"?>
-<ds:datastoreItem xmlns:ds="http://schemas.openxmlformats.org/officeDocument/2006/customXml" ds:itemID="{A54A7BAB-3FEA-4809-93D1-91AD5D2E8C6D}">
+<ds:datastoreItem xmlns:ds="http://schemas.openxmlformats.org/officeDocument/2006/customXml" ds:itemID="{6ED6A4ED-06AC-446C-9DAB-DC50F18C37F0}">
   <ds:schemaRefs>
     <ds:schemaRef ds:uri="http://schemas.openxmlformats.org/officeDocument/2006/bibliography"/>
   </ds:schemaRefs>

</xml_diff>